<commit_message>
Update manuscript and references to correct author name and publication date
</commit_message>
<xml_diff>
--- a/sample_projects/chw-maternal-mental-health/manuscript.docx
+++ b/sample_projects/chw-maternal-mental-health/manuscript.docx
@@ -23,7 +23,7 @@
         <w:pStyle w:val="Date"/>
       </w:pPr>
       <w:r>
-        <w:t xml:space="preserve">2026-03-14</w:t>
+        <w:t xml:space="preserve">2026-03-15</w:t>
       </w:r>
     </w:p>
     <w:p>
@@ -600,7 +600,7 @@
         <w:t xml:space="preserve"> </w:t>
       </w:r>
       <w:r>
-        <w:t xml:space="preserve">(Zyl, 2026)</w:t>
+        <w:t xml:space="preserve">(van Zyl, 2026)</w:t>
       </w:r>
       <w:r>
         <w:t xml:space="preserve">, accessed through GitHub Copilot in VS Code, was used to assist with: literature search execution across databases, record deduplication, presentation of records for screening, data extraction form design, abstract-based data extraction, risk of bias assessment scaffolding, PRISMA flow tracking, and manuscript drafting. As this is a sample project demonstrating tool functionality, no independent human verification of AI-assisted outputs was performed. Outputs may contain errors.</w:t>
@@ -3902,7 +3902,7 @@
         <w:t xml:space="preserve"> </w:t>
       </w:r>
       <w:r>
-        <w:t xml:space="preserve">(Zyl, 2026)</w:t>
+        <w:t xml:space="preserve">(van Zyl, 2026)</w:t>
       </w:r>
       <w:r>
         <w:t xml:space="preserve">, accessed through GitHub Copilot in VS Code, to demonstrate tool capabilities including: literature search execution across databases, record deduplication, screening presentation, data extraction, risk of bias assessment scaffolding, PRISMA flow tracking, synthesis drafting, and manuscript preparation. No author reviewed, verified, or approved the outputs. A detailed log of AI contributions is maintained in the project repository.</w:t>
@@ -4644,7 +4644,44 @@
       </w:hyperlink>
     </w:p>
     <w:bookmarkEnd w:id="83"/>
-    <w:bookmarkStart w:id="85" w:name="ref-vanobberghen2020"/>
+    <w:bookmarkStart w:id="85" w:name="ref-vanzyl2026rwa"/>
+    <w:p>
+      <w:pPr>
+        <w:pStyle w:val="Bibliography"/>
+      </w:pPr>
+      <w:r>
+        <w:t xml:space="preserve">van Zyl, A. (2026).</w:t>
+      </w:r>
+      <w:r>
+        <w:t xml:space="preserve"> </w:t>
+      </w:r>
+      <w:r>
+        <w:rPr>
+          <w:i/>
+          <w:iCs/>
+        </w:rPr>
+        <w:t xml:space="preserve">Research workflow assistant (RWA)</w:t>
+      </w:r>
+      <w:r>
+        <w:t xml:space="preserve"> </w:t>
+      </w:r>
+      <w:r>
+        <w:t xml:space="preserve">[Computer software].</w:t>
+      </w:r>
+      <w:r>
+        <w:t xml:space="preserve"> </w:t>
+      </w:r>
+      <w:hyperlink r:id="rId84">
+        <w:r>
+          <w:rPr>
+            <w:rStyle w:val="Hyperlink"/>
+          </w:rPr>
+          <w:t xml:space="preserve">https://github.com/andre-inter-collab-llc/research-workflow-assistant</w:t>
+        </w:r>
+      </w:hyperlink>
+    </w:p>
+    <w:bookmarkEnd w:id="85"/>
+    <w:bookmarkStart w:id="87" w:name="ref-vanobberghen2020"/>
     <w:p>
       <w:pPr>
         <w:pStyle w:val="Bibliography"/>
@@ -4714,7 +4751,7 @@
       <w:r>
         <w:t xml:space="preserve"> </w:t>
       </w:r>
-      <w:hyperlink r:id="rId84">
+      <w:hyperlink r:id="rId86">
         <w:r>
           <w:rPr>
             <w:rStyle w:val="Hyperlink"/>
@@ -4723,8 +4760,8 @@
         </w:r>
       </w:hyperlink>
     </w:p>
-    <w:bookmarkEnd w:id="85"/>
-    <w:bookmarkStart w:id="87" w:name="ref-wang2025"/>
+    <w:bookmarkEnd w:id="87"/>
+    <w:bookmarkStart w:id="89" w:name="ref-wang2025"/>
     <w:p>
       <w:pPr>
         <w:pStyle w:val="Bibliography"/>
@@ -4770,7 +4807,7 @@
       <w:r>
         <w:t xml:space="preserve"> </w:t>
       </w:r>
-      <w:hyperlink r:id="rId86">
+      <w:hyperlink r:id="rId88">
         <w:r>
           <w:rPr>
             <w:rStyle w:val="Hyperlink"/>
@@ -4779,8 +4816,8 @@
         </w:r>
       </w:hyperlink>
     </w:p>
-    <w:bookmarkEnd w:id="87"/>
-    <w:bookmarkStart w:id="89" w:name="ref-woody2017"/>
+    <w:bookmarkEnd w:id="89"/>
+    <w:bookmarkStart w:id="91" w:name="ref-woody2017"/>
     <w:p>
       <w:pPr>
         <w:pStyle w:val="Bibliography"/>
@@ -4817,7 +4854,7 @@
       <w:r>
         <w:t xml:space="preserve"> </w:t>
       </w:r>
-      <w:hyperlink r:id="rId88">
+      <w:hyperlink r:id="rId90">
         <w:r>
           <w:rPr>
             <w:rStyle w:val="Hyperlink"/>
@@ -4826,8 +4863,8 @@
         </w:r>
       </w:hyperlink>
     </w:p>
-    <w:bookmarkEnd w:id="89"/>
-    <w:bookmarkStart w:id="91" w:name="ref-who2008taskshifting"/>
+    <w:bookmarkEnd w:id="91"/>
+    <w:bookmarkStart w:id="93" w:name="ref-who2008taskshifting"/>
     <w:p>
       <w:pPr>
         <w:pStyle w:val="Bibliography"/>
@@ -4851,7 +4888,7 @@
       <w:r>
         <w:t xml:space="preserve"> </w:t>
       </w:r>
-      <w:hyperlink r:id="rId90">
+      <w:hyperlink r:id="rId92">
         <w:r>
           <w:rPr>
             <w:rStyle w:val="Hyperlink"/>
@@ -4860,8 +4897,8 @@
         </w:r>
       </w:hyperlink>
     </w:p>
-    <w:bookmarkEnd w:id="91"/>
-    <w:bookmarkStart w:id="93" w:name="ref-who2021atlas"/>
+    <w:bookmarkEnd w:id="93"/>
+    <w:bookmarkStart w:id="95" w:name="ref-who2021atlas"/>
     <w:p>
       <w:pPr>
         <w:pStyle w:val="Bibliography"/>
@@ -4885,49 +4922,12 @@
       <w:r>
         <w:t xml:space="preserve"> </w:t>
       </w:r>
-      <w:hyperlink r:id="rId92">
+      <w:hyperlink r:id="rId94">
         <w:r>
           <w:rPr>
             <w:rStyle w:val="Hyperlink"/>
           </w:rPr>
           <w:t xml:space="preserve">https://www.who.int/publications/i/item/9789240036703</w:t>
-        </w:r>
-      </w:hyperlink>
-    </w:p>
-    <w:bookmarkEnd w:id="93"/>
-    <w:bookmarkStart w:id="95" w:name="ref-vanzyl2026rwa"/>
-    <w:p>
-      <w:pPr>
-        <w:pStyle w:val="Bibliography"/>
-      </w:pPr>
-      <w:r>
-        <w:t xml:space="preserve">Zyl, A. van. (2026).</w:t>
-      </w:r>
-      <w:r>
-        <w:t xml:space="preserve"> </w:t>
-      </w:r>
-      <w:r>
-        <w:rPr>
-          <w:i/>
-          <w:iCs/>
-        </w:rPr>
-        <w:t xml:space="preserve">Research workflow assistant (RWA)</w:t>
-      </w:r>
-      <w:r>
-        <w:t xml:space="preserve"> </w:t>
-      </w:r>
-      <w:r>
-        <w:t xml:space="preserve">[Computer software].</w:t>
-      </w:r>
-      <w:r>
-        <w:t xml:space="preserve"> </w:t>
-      </w:r>
-      <w:hyperlink r:id="rId94">
-        <w:r>
-          <w:rPr>
-            <w:rStyle w:val="Hyperlink"/>
-          </w:rPr>
-          <w:t xml:space="preserve">https://github.com/avanzyl/research-workflow-assistant</w:t>
         </w:r>
       </w:hyperlink>
     </w:p>

</xml_diff>

<commit_message>
Add bibliography manager MCP server and critical appraisal templates
- Introduced a new bibliography manager MCP server for local reference management without Zotero.
- Implemented core functionalities including adding items, importing from BibTeX/RIS, linking files, and managing notes and annotations.
- Added critical appraisal templates for CASP qualitative, CASP RCT, STROBE observational studies, and a cross-study summary.
- Included a Zotero plugins guide to enhance the Research Workflow Assistant experience.
</commit_message>
<xml_diff>
--- a/sample_projects/chw-maternal-mental-health/manuscript.docx
+++ b/sample_projects/chw-maternal-mental-health/manuscript.docx
@@ -23,7 +23,7 @@
         <w:pStyle w:val="Date"/>
       </w:pPr>
       <w:r>
-        <w:t xml:space="preserve">2026-03-15</w:t>
+        <w:t xml:space="preserve">2026-03-16</w:t>
       </w:r>
     </w:p>
     <w:p>
@@ -608,7 +608,7 @@
     </w:p>
     <w:bookmarkEnd w:id="30"/>
     <w:bookmarkEnd w:id="31"/>
-    <w:bookmarkStart w:id="46" w:name="results"/>
+    <w:bookmarkStart w:id="50" w:name="results"/>
     <w:p>
       <w:pPr>
         <w:pStyle w:val="Heading1"/>
@@ -617,7 +617,7 @@
         <w:t xml:space="preserve">3. Results</w:t>
       </w:r>
     </w:p>
-    <w:bookmarkStart w:id="33" w:name="study-selection-1"/>
+    <w:bookmarkStart w:id="37" w:name="study-selection-1"/>
     <w:p>
       <w:pPr>
         <w:pStyle w:val="Heading2"/>
@@ -658,211 +658,87 @@
       <w:tr>
         <w:tc>
           <w:tcPr/>
-          <w:bookmarkStart w:id="32" w:name="fig-prisma"/>
-          <w:p>
-            <w:pPr>
-              <w:jc w:val="center"/>
-            </w:pPr>
-            <w:r>
-              <w:rPr>
-                <w:b/>
-                <w:bCs/>
-              </w:rPr>
-              <w:t xml:space="preserve">PRISMA 2020 Flow Diagram</w:t>
-            </w:r>
-          </w:p>
-          <w:p>
-            <w:pPr>
-              <w:pStyle w:val="SourceCode"/>
-              <w:jc w:val="center"/>
-            </w:pPr>
-            <w:r>
-              <w:rPr>
-                <w:rStyle w:val="VerbatimChar"/>
-              </w:rPr>
-              <w:t xml:space="preserve">Records identified from databases (n = 265,416)</w:t>
-            </w:r>
-            <w:r>
-              <w:br/>
-            </w:r>
-            <w:r>
-              <w:rPr>
-                <w:rStyle w:val="VerbatimChar"/>
-              </w:rPr>
-              <w:t xml:space="preserve">  PubMed: 59 | OpenAlex: 1,442 | Semantic Scholar: 162 | CrossRef: 263,753</w:t>
-            </w:r>
-            <w:r>
-              <w:br/>
-            </w:r>
-            <w:r>
-              <w:rPr>
-                <w:rStyle w:val="VerbatimChar"/>
-              </w:rPr>
-              <w:t xml:space="preserve">                          |</w:t>
-            </w:r>
-            <w:r>
-              <w:br/>
-            </w:r>
-            <w:r>
-              <w:rPr>
-                <w:rStyle w:val="VerbatimChar"/>
-              </w:rPr>
-              <w:t xml:space="preserve">            Top records retrieved (n = 200)</w:t>
-            </w:r>
-            <w:r>
-              <w:br/>
-            </w:r>
-            <w:r>
-              <w:rPr>
-                <w:rStyle w:val="VerbatimChar"/>
-              </w:rPr>
-              <w:t xml:space="preserve">                          |</w:t>
-            </w:r>
-            <w:r>
-              <w:br/>
-            </w:r>
-            <w:r>
-              <w:rPr>
-                <w:rStyle w:val="VerbatimChar"/>
-              </w:rPr>
-              <w:t xml:space="preserve">            Duplicates removed (n = 15)</w:t>
-            </w:r>
-            <w:r>
-              <w:br/>
-            </w:r>
-            <w:r>
-              <w:rPr>
-                <w:rStyle w:val="VerbatimChar"/>
-              </w:rPr>
-              <w:t xml:space="preserve">                          |</w:t>
-            </w:r>
-            <w:r>
-              <w:br/>
-            </w:r>
-            <w:r>
-              <w:rPr>
-                <w:rStyle w:val="VerbatimChar"/>
-              </w:rPr>
-              <w:t xml:space="preserve">         Records screened at title/abstract (n = 185)</w:t>
-            </w:r>
-            <w:r>
-              <w:br/>
-            </w:r>
-            <w:r>
-              <w:rPr>
-                <w:rStyle w:val="VerbatimChar"/>
-              </w:rPr>
-              <w:t xml:space="preserve">                          |</w:t>
-            </w:r>
-            <w:r>
-              <w:br/>
-            </w:r>
-            <w:r>
-              <w:rPr>
-                <w:rStyle w:val="VerbatimChar"/>
-              </w:rPr>
-              <w:t xml:space="preserve">            Records excluded (n = 0)</w:t>
-            </w:r>
-            <w:r>
-              <w:br/>
-            </w:r>
-            <w:r>
-              <w:rPr>
-                <w:rStyle w:val="VerbatimChar"/>
-              </w:rPr>
-              <w:t xml:space="preserve">                          |</w:t>
-            </w:r>
-            <w:r>
-              <w:br/>
-            </w:r>
-            <w:r>
-              <w:rPr>
-                <w:rStyle w:val="VerbatimChar"/>
-              </w:rPr>
-              <w:t xml:space="preserve">        Full-text records assessed (n = 46)</w:t>
-            </w:r>
-            <w:r>
-              <w:br/>
-            </w:r>
-            <w:r>
-              <w:rPr>
-                <w:rStyle w:val="VerbatimChar"/>
-              </w:rPr>
-              <w:t xml:space="preserve">              |                        |</w:t>
-            </w:r>
-            <w:r>
-              <w:br/>
-            </w:r>
-            <w:r>
-              <w:rPr>
-                <w:rStyle w:val="VerbatimChar"/>
-              </w:rPr>
-              <w:t xml:space="preserve">     Excluded (n = 39)          Included (n = 7)</w:t>
-            </w:r>
-            <w:r>
-              <w:br/>
-            </w:r>
-            <w:r>
-              <w:rPr>
-                <w:rStyle w:val="VerbatimChar"/>
-              </w:rPr>
-              <w:t xml:space="preserve">       Wrong design - SR/MA (9)        |</w:t>
-            </w:r>
-            <w:r>
-              <w:br/>
-            </w:r>
-            <w:r>
-              <w:rPr>
-                <w:rStyle w:val="VerbatimChar"/>
-              </w:rPr>
-              <w:t xml:space="preserve">       Protocol only (12)        Qualitative synthesis (n = 7)</w:t>
-            </w:r>
-            <w:r>
-              <w:br/>
-            </w:r>
-            <w:r>
-              <w:rPr>
-                <w:rStyle w:val="VerbatimChar"/>
-              </w:rPr>
-              <w:t xml:space="preserve">       Wrong design - non-RCT (7)     |</w:t>
-            </w:r>
-            <w:r>
-              <w:br/>
-            </w:r>
-            <w:r>
-              <w:rPr>
-                <w:rStyle w:val="VerbatimChar"/>
-              </w:rPr>
-              <w:t xml:space="preserve">       Wrong outcome (6)         Quantitative synthesis (n = 0)</w:t>
-            </w:r>
-            <w:r>
-              <w:br/>
-            </w:r>
-            <w:r>
-              <w:rPr>
-                <w:rStyle w:val="VerbatimChar"/>
-              </w:rPr>
-              <w:t xml:space="preserve">       HIC setting (3)            (meta-analysis not feasible)</w:t>
-            </w:r>
-            <w:r>
-              <w:br/>
-            </w:r>
-            <w:r>
-              <w:rPr>
-                <w:rStyle w:val="VerbatimChar"/>
-              </w:rPr>
-              <w:t xml:space="preserve">       Wrong population (1)</w:t>
-            </w:r>
-            <w:r>
-              <w:br/>
-            </w:r>
-            <w:r>
-              <w:rPr>
-                <w:rStyle w:val="VerbatimChar"/>
-              </w:rPr>
-              <w:t xml:space="preserve">       Unable to retrieve (1)</w:t>
-            </w:r>
-          </w:p>
+          <w:bookmarkStart w:id="36" w:name="fig-prisma"/>
+          <w:tbl>
+            <w:tblPr>
+              <w:tblStyle w:val="Table"/>
+              <w:tblW w:type="pct" w:w="5000"/>
+              <w:tblLayout w:type="fixed"/>
+              <w:tblLook w:firstRow="0" w:lastRow="0" w:firstColumn="0" w:lastColumn="0" w:noHBand="0" w:noVBand="0" w:val="0000"/>
+            </w:tblPr>
+            <w:tblGrid>
+              <w:gridCol w:w="7920"/>
+            </w:tblGrid>
+            <w:tr>
+              <w:tc>
+                <w:tcPr/>
+                <w:bookmarkStart w:id="35" w:name="fig-prisma"/>
+                <w:p>
+                  <w:pPr>
+                    <w:jc w:val="center"/>
+                    <w:jc w:val="center"/>
+                  </w:pPr>
+                  <w:r>
+                    <w:drawing>
+                      <wp:inline>
+                        <wp:extent cx="5334000" cy="10549114"/>
+                        <wp:effectExtent b="0" l="0" r="0" t="0"/>
+                        <wp:docPr descr="" title="" id="33" name="Picture"/>
+                        <a:graphic>
+                          <a:graphicData uri="http://schemas.openxmlformats.org/drawingml/2006/picture">
+                            <pic:pic>
+                              <pic:nvPicPr>
+                                <pic:cNvPr descr="manuscript_files\figure-docx\mermaid-figure-1.png" id="34" name="Picture"/>
+                                <pic:cNvPicPr>
+                                  <a:picLocks noChangeArrowheads="1" noChangeAspect="1"/>
+                                </pic:cNvPicPr>
+                              </pic:nvPicPr>
+                              <pic:blipFill>
+                                <a:blip r:embed="rId32"/>
+                                <a:stretch>
+                                  <a:fillRect/>
+                                </a:stretch>
+                              </pic:blipFill>
+                              <pic:spPr bwMode="auto">
+                                <a:xfrm>
+                                  <a:off x="0" y="0"/>
+                                  <a:ext cx="5334000" cy="10549114"/>
+                                </a:xfrm>
+                                <a:prstGeom prst="rect">
+                                  <a:avLst/>
+                                </a:prstGeom>
+                                <a:noFill/>
+                                <a:ln w="9525">
+                                  <a:noFill/>
+                                  <a:headEnd/>
+                                  <a:tailEnd/>
+                                </a:ln>
+                              </pic:spPr>
+                            </pic:pic>
+                          </a:graphicData>
+                        </a:graphic>
+                      </wp:inline>
+                    </w:drawing>
+                  </w:r>
+                </w:p>
+                <w:p>
+                  <w:pPr>
+                    <w:jc w:val="center"/>
+                    <w:jc w:val="center"/>
+                  </w:pPr>
+                  <w:pPr>
+                    <w:jc w:val="left"/>
+                    <w:spacing w:before="200"/>
+                    <w:pStyle w:val="ImageCaption"/>
+                  </w:pPr>
+                  <w:r>
+                    <w:t xml:space="preserve">(a) PRISMA 2020 flow diagram of study selection.</w:t>
+                  </w:r>
+                </w:p>
+                <w:bookmarkEnd w:id="35"/>
+              </w:tc>
+            </w:tr>
+          </w:tbl>
           <w:p>
             <w:pPr>
               <w:jc w:val="center"/>
@@ -873,15 +749,15 @@
               <w:pStyle w:val="ImageCaption"/>
             </w:pPr>
             <w:r>
-              <w:t xml:space="preserve">Figure 1: PRISMA 2020 flow diagram of study selection.</w:t>
+              <w:t xml:space="preserve">Figure 1</w:t>
             </w:r>
           </w:p>
-          <w:bookmarkEnd w:id="32"/>
+          <w:bookmarkEnd w:id="36"/>
         </w:tc>
       </w:tr>
     </w:tbl>
-    <w:bookmarkEnd w:id="33"/>
-    <w:bookmarkStart w:id="35" w:name="study-characteristics"/>
+    <w:bookmarkEnd w:id="37"/>
+    <w:bookmarkStart w:id="39" w:name="study-characteristics"/>
     <w:p>
       <w:pPr>
         <w:pStyle w:val="Heading2"/>
@@ -922,7 +798,7 @@
       <w:tr>
         <w:tc>
           <w:tcPr/>
-          <w:bookmarkStart w:id="34" w:name="tbl-characteristics"/>
+          <w:bookmarkStart w:id="38" w:name="tbl-characteristics"/>
           <w:p>
             <w:pPr>
               <w:jc w:val="center"/>
@@ -1862,7 +1738,7 @@
               </w:tc>
             </w:tr>
           </w:tbl>
-          <w:bookmarkEnd w:id="34"/>
+          <w:bookmarkEnd w:id="38"/>
           <w:p/>
         </w:tc>
       </w:tr>
@@ -1884,8 +1760,8 @@
         <w:t xml:space="preserve">, while the remaining four enrolled women regardless of depression status.</w:t>
       </w:r>
     </w:p>
-    <w:bookmarkEnd w:id="35"/>
-    <w:bookmarkStart w:id="36" w:name="interventions"/>
+    <w:bookmarkEnd w:id="39"/>
+    <w:bookmarkStart w:id="40" w:name="interventions"/>
     <w:p>
       <w:pPr>
         <w:pStyle w:val="Heading2"/>
@@ -2009,8 +1885,8 @@
         <w:t xml:space="preserve">; training duration was not reported for five studies.</w:t>
       </w:r>
     </w:p>
-    <w:bookmarkEnd w:id="36"/>
-    <w:bookmarkStart w:id="37" w:name="outcome-measures"/>
+    <w:bookmarkEnd w:id="40"/>
+    <w:bookmarkStart w:id="41" w:name="outcome-measures"/>
     <w:p>
       <w:pPr>
         <w:pStyle w:val="Heading2"/>
@@ -2108,8 +1984,8 @@
         <w:t xml:space="preserve">used a clinician-rated instrument; all others relied on self-report measures.</w:t>
       </w:r>
     </w:p>
-    <w:bookmarkEnd w:id="37"/>
-    <w:bookmarkStart w:id="40" w:name="effectiveness"/>
+    <w:bookmarkEnd w:id="41"/>
+    <w:bookmarkStart w:id="44" w:name="effectiveness"/>
     <w:p>
       <w:pPr>
         <w:pStyle w:val="Heading2"/>
@@ -2118,7 +1994,7 @@
         <w:t xml:space="preserve">3.5 Effectiveness</w:t>
       </w:r>
     </w:p>
-    <w:bookmarkStart w:id="38" w:name="studies-reporting-significant-benefits"/>
+    <w:bookmarkStart w:id="42" w:name="studies-reporting-significant-benefits"/>
     <w:p>
       <w:pPr>
         <w:pStyle w:val="Heading3"/>
@@ -2177,8 +2053,8 @@
         <w:t xml:space="preserve">evaluated a psychoeducation plus unconditional cash transfer intervention in urban Bangladesh (n = 587 randomized, 547 analyzed). Depression scores on the SRQ-20 decreased significantly (β = −1.53, 95% CI: −2.28 to −0.80, p &lt; .001; Cohen’s d = −0.20). All four quality-of-life domains also improved significantly. Depression was a secondary outcome; the trial was primarily designed to assess child development.</w:t>
       </w:r>
     </w:p>
-    <w:bookmarkEnd w:id="38"/>
-    <w:bookmarkStart w:id="39" w:name="X5405a48b039e673dc110420d58ad9bed632ffd9"/>
+    <w:bookmarkEnd w:id="42"/>
+    <w:bookmarkStart w:id="43" w:name="X5405a48b039e673dc110420d58ad9bed632ffd9"/>
     <w:p>
       <w:pPr>
         <w:pStyle w:val="Heading3"/>
@@ -2251,9 +2127,9 @@
         <w:t xml:space="preserve">was a pilot RCT (n = 72) of the Thula Baba Box plus CHW program in South Africa. A 0.928-point reduction on an unnamed 1–8 depression scale was reported without confidence intervals or significance testing.</w:t>
       </w:r>
     </w:p>
-    <w:bookmarkEnd w:id="39"/>
-    <w:bookmarkEnd w:id="40"/>
-    <w:bookmarkStart w:id="42" w:name="risk-of-bias"/>
+    <w:bookmarkEnd w:id="43"/>
+    <w:bookmarkEnd w:id="44"/>
+    <w:bookmarkStart w:id="46" w:name="risk-of-bias"/>
     <w:p>
       <w:pPr>
         <w:pStyle w:val="Heading2"/>
@@ -2312,7 +2188,7 @@
       <w:tr>
         <w:tc>
           <w:tcPr/>
-          <w:bookmarkStart w:id="41" w:name="tbl-rob2"/>
+          <w:bookmarkStart w:id="45" w:name="tbl-rob2"/>
           <w:p>
             <w:pPr>
               <w:jc w:val="center"/>
@@ -3034,7 +2910,7 @@
               </w:tc>
             </w:tr>
           </w:tbl>
-          <w:bookmarkEnd w:id="41"/>
+          <w:bookmarkEnd w:id="45"/>
           <w:p/>
         </w:tc>
       </w:tr>
@@ -3091,8 +2967,8 @@
         <w:t xml:space="preserve">reported positive results. Among the five studies at some concerns, results were mixed.</w:t>
       </w:r>
     </w:p>
-    <w:bookmarkEnd w:id="42"/>
-    <w:bookmarkStart w:id="43" w:name="meta-analysis-feasibility"/>
+    <w:bookmarkEnd w:id="46"/>
+    <w:bookmarkStart w:id="47" w:name="meta-analysis-feasibility"/>
     <w:p>
       <w:pPr>
         <w:pStyle w:val="Heading2"/>
@@ -3157,8 +3033,8 @@
         <w:t xml:space="preserve">. Second, six different outcome instruments were used, and several — SRQ-20, DASS-21, and the unnamed 1–8 scale — measure related but distinct constructs, limiting the interpretability of pooled standardized differences. Third, studies varied substantially in population (treatment vs. prevention samples), intervention type, comparator, follow-up duration, and design, producing clinical and methodological heterogeneity that would undermine the validity of a pooled estimate even if effect sizes were available. With only seven studies, planned subgroup and sensitivity analyses would be underpowered.</w:t>
       </w:r>
     </w:p>
-    <w:bookmarkEnd w:id="43"/>
-    <w:bookmarkStart w:id="45" w:name="certainty-of-evidence-grade"/>
+    <w:bookmarkEnd w:id="47"/>
+    <w:bookmarkStart w:id="49" w:name="certainty-of-evidence-grade"/>
     <w:p>
       <w:pPr>
         <w:pStyle w:val="Heading2"/>
@@ -3215,7 +3091,7 @@
       <w:tr>
         <w:tc>
           <w:tcPr/>
-          <w:bookmarkStart w:id="44" w:name="tbl-grade"/>
+          <w:bookmarkStart w:id="48" w:name="tbl-grade"/>
           <w:p>
             <w:pPr>
               <w:jc w:val="center"/>
@@ -3553,14 +3429,14 @@
               </w:tc>
             </w:tr>
           </w:tbl>
-          <w:bookmarkEnd w:id="44"/>
+          <w:bookmarkEnd w:id="48"/>
           <w:p/>
         </w:tc>
       </w:tr>
     </w:tbl>
-    <w:bookmarkEnd w:id="45"/>
-    <w:bookmarkEnd w:id="46"/>
-    <w:bookmarkStart w:id="53" w:name="discussion"/>
+    <w:bookmarkEnd w:id="49"/>
+    <w:bookmarkEnd w:id="50"/>
+    <w:bookmarkStart w:id="57" w:name="discussion"/>
     <w:p>
       <w:pPr>
         <w:pStyle w:val="Heading1"/>
@@ -3569,7 +3445,7 @@
         <w:t xml:space="preserve">4. Discussion</w:t>
       </w:r>
     </w:p>
-    <w:bookmarkStart w:id="47" w:name="summary-of-evidence"/>
+    <w:bookmarkStart w:id="51" w:name="summary-of-evidence"/>
     <w:p>
       <w:pPr>
         <w:pStyle w:val="Heading2"/>
@@ -3586,8 +3462,8 @@
         <w:t xml:space="preserve">This systematic review identified seven RCTs evaluating CHW-delivered psychosocial and psychological interventions for perinatal women across six LMICs. The evidence revealed a mixed and heterogeneous picture: three studies in lower-middle-income countries found significant depression reductions, while all four studies in upper-middle-income countries found null or transient effects. Meta-analysis was not feasible due to heterogeneity in outcome measures, insufficient reporting of effect-size components, and clinical diversity across studies. The certainty of evidence was rated very low using the GRADE framework.</w:t>
       </w:r>
     </w:p>
-    <w:bookmarkEnd w:id="47"/>
-    <w:bookmarkStart w:id="48" w:name="patterns-in-effectiveness"/>
+    <w:bookmarkEnd w:id="51"/>
+    <w:bookmarkStart w:id="52" w:name="patterns-in-effectiveness"/>
     <w:p>
       <w:pPr>
         <w:pStyle w:val="Heading2"/>
@@ -3632,8 +3508,8 @@
         <w:t xml:space="preserve">Third, the association between lower risk of bias and null findings is concerning and may indicate that positive effects reported in higher-risk studies are partially attributable to methodological limitations — particularly the combination of unblinded interventions with self-report outcomes, which is susceptible to expectancy and social desirability bias.</w:t>
       </w:r>
     </w:p>
-    <w:bookmarkEnd w:id="48"/>
-    <w:bookmarkStart w:id="49" w:name="strengths-and-limitations"/>
+    <w:bookmarkEnd w:id="52"/>
+    <w:bookmarkStart w:id="53" w:name="strengths-and-limitations"/>
     <w:p>
       <w:pPr>
         <w:pStyle w:val="Heading2"/>
@@ -3658,8 +3534,8 @@
         <w:t xml:space="preserve">Key limitations include: (1) reliance on abstract-level data for five of seven studies, as full text was not openly accessible for most included studies — this may result in incomplete or imprecise data extraction; (2) search strategy limitations, as Europe PMC returned no results due to an API issue, and the high-volume CrossRef results suggest the query may have been overly broad for that database; (3) single-reviewer screening and extraction, which increases the risk of errors; (4) inability to perform meta-analysis, limiting the strength of quantitative conclusions; and (5) the small number of included studies (n = 7), which limits subgroup analysis and formal assessment of publication bias.</w:t>
       </w:r>
     </w:p>
-    <w:bookmarkEnd w:id="49"/>
-    <w:bookmarkStart w:id="50" w:name="comparison-with-previous-reviews"/>
+    <w:bookmarkEnd w:id="53"/>
+    <w:bookmarkStart w:id="54" w:name="comparison-with-previous-reviews"/>
     <w:p>
       <w:pPr>
         <w:pStyle w:val="Heading2"/>
@@ -3700,8 +3576,8 @@
         <w:t xml:space="preserve">trial, add to a growing recognition that CHW mental health interventions do not universally improve outcomes and that context, implementation quality, and study design significantly influence results.</w:t>
       </w:r>
     </w:p>
-    <w:bookmarkEnd w:id="50"/>
-    <w:bookmarkStart w:id="51" w:name="implications-for-practice"/>
+    <w:bookmarkEnd w:id="54"/>
+    <w:bookmarkStart w:id="55" w:name="implications-for-practice"/>
     <w:p>
       <w:pPr>
         <w:pStyle w:val="Heading2"/>
@@ -3718,8 +3594,8 @@
         <w:t xml:space="preserve">Given the very low certainty of evidence, practice recommendations must be tentative. Integration of mental health components into existing CHW parenting or nutrition programs appears promising in lower-middle-income settings. Screening for depression and targeting interventions to symptomatic women may improve effectiveness over universal prevention approaches. Adequate CHW training (at least 10 days) and compliance monitoring appear to be important implementation factors.</w:t>
       </w:r>
     </w:p>
-    <w:bookmarkEnd w:id="51"/>
-    <w:bookmarkStart w:id="52" w:name="implications-for-research"/>
+    <w:bookmarkEnd w:id="55"/>
+    <w:bookmarkStart w:id="56" w:name="implications-for-research"/>
     <w:p>
       <w:pPr>
         <w:pStyle w:val="Heading2"/>
@@ -3736,9 +3612,9 @@
         <w:t xml:space="preserve">Future trials should prioritize: (1) reporting of group means, standard deviations, and standardized effect sizes to enable meta-analysis; (2) use of common validated outcome measures such as the EPDS for perinatal populations; (3) blinded outcome assessment where feasible; (4) long-term follow-up beyond 12 months; (5) inclusion of low-income country settings; and (6) designs with maternal mental health as the primary outcome rather than a secondary endpoint of child development trials.</w:t>
       </w:r>
     </w:p>
-    <w:bookmarkEnd w:id="52"/>
-    <w:bookmarkEnd w:id="53"/>
-    <w:bookmarkStart w:id="54" w:name="conclusions"/>
+    <w:bookmarkEnd w:id="56"/>
+    <w:bookmarkEnd w:id="57"/>
+    <w:bookmarkStart w:id="58" w:name="conclusions"/>
     <w:p>
       <w:pPr>
         <w:pStyle w:val="Heading1"/>
@@ -3755,8 +3631,8 @@
         <w:t xml:space="preserve">This systematic review found very low certainty evidence that CHW-delivered interventions may reduce depression symptoms among perinatal women in LMICs. Effectiveness appeared more consistent in lower-middle-income settings and with integrated intervention approaches targeting clinically depressed women. However, the evidence is limited by substantial heterogeneity in interventions, outcome measures, and study quality. The inability to conduct meta-analysis due to inconsistent effect-size reporting underscores the need for standardized outcome reporting in future trials. High-quality trials in low-income countries, with long-term follow-up and standardized outcome measures, are urgently needed to strengthen this evidence base.</w:t>
       </w:r>
     </w:p>
-    <w:bookmarkEnd w:id="54"/>
-    <w:bookmarkStart w:id="57" w:name="acknowledgments-and-ai-disclosure"/>
+    <w:bookmarkEnd w:id="58"/>
+    <w:bookmarkStart w:id="61" w:name="acknowledgments-and-ai-disclosure"/>
     <w:p>
       <w:pPr>
         <w:pStyle w:val="Heading1"/>
@@ -3806,12 +3682,12 @@
                 <wp:inline>
                   <wp:extent cx="152400" cy="152400"/>
                   <wp:effectExtent b="0" l="0" r="0" t="0"/>
-                  <wp:docPr descr="" title="" id="55" name="Picture"/>
+                  <wp:docPr descr="" title="" id="59" name="Picture"/>
                   <a:graphic>
                     <a:graphicData uri="http://schemas.openxmlformats.org/drawingml/2006/picture">
                       <pic:pic>
                         <pic:nvPicPr>
-                          <pic:cNvPr descr="C:\Users\andre\AppData\Local\Apps\Quarto\share\formats\docx\warning.png" id="56" name="Picture"/>
+                          <pic:cNvPr descr="C:\Users\andre\AppData\Local\Apps\Quarto\share\formats\docx\warning.png" id="60" name="Picture"/>
                           <pic:cNvPicPr>
                             <a:picLocks noChangeArrowheads="1" noChangeAspect="1"/>
                           </pic:cNvPicPr>
@@ -3935,8 +3811,8 @@
         <w:t xml:space="preserve">, which provides data under a CC BY-NC license.</w:t>
       </w:r>
     </w:p>
-    <w:bookmarkEnd w:id="57"/>
-    <w:bookmarkStart w:id="97" w:name="references"/>
+    <w:bookmarkEnd w:id="61"/>
+    <w:bookmarkStart w:id="101" w:name="references"/>
     <w:p>
       <w:pPr>
         <w:pStyle w:val="Heading1"/>
@@ -3945,8 +3821,8 @@
         <w:t xml:space="preserve">References</w:t>
       </w:r>
     </w:p>
-    <w:bookmarkStart w:id="96" w:name="refs"/>
-    <w:bookmarkStart w:id="59" w:name="ref-fisher2012"/>
+    <w:bookmarkStart w:id="100" w:name="refs"/>
+    <w:bookmarkStart w:id="63" w:name="ref-fisher2012"/>
     <w:p>
       <w:pPr>
         <w:pStyle w:val="Bibliography"/>
@@ -3983,7 +3859,7 @@
       <w:r>
         <w:t xml:space="preserve"> </w:t>
       </w:r>
-      <w:hyperlink r:id="rId58">
+      <w:hyperlink r:id="rId62">
         <w:r>
           <w:rPr>
             <w:rStyle w:val="Hyperlink"/>
@@ -3992,8 +3868,8 @@
         </w:r>
       </w:hyperlink>
     </w:p>
-    <w:bookmarkEnd w:id="59"/>
-    <w:bookmarkStart w:id="61" w:name="ref-guyatt2011grade"/>
+    <w:bookmarkEnd w:id="63"/>
+    <w:bookmarkStart w:id="65" w:name="ref-guyatt2011grade"/>
     <w:p>
       <w:pPr>
         <w:pStyle w:val="Bibliography"/>
@@ -4039,7 +3915,7 @@
       <w:r>
         <w:t xml:space="preserve"> </w:t>
       </w:r>
-      <w:hyperlink r:id="rId60">
+      <w:hyperlink r:id="rId64">
         <w:r>
           <w:rPr>
             <w:rStyle w:val="Hyperlink"/>
@@ -4048,8 +3924,8 @@
         </w:r>
       </w:hyperlink>
     </w:p>
-    <w:bookmarkEnd w:id="61"/>
-    <w:bookmarkStart w:id="63" w:name="ref-hossain2024"/>
+    <w:bookmarkEnd w:id="65"/>
+    <w:bookmarkStart w:id="67" w:name="ref-hossain2024"/>
     <w:p>
       <w:pPr>
         <w:pStyle w:val="Bibliography"/>
@@ -4095,7 +3971,7 @@
       <w:r>
         <w:t xml:space="preserve"> </w:t>
       </w:r>
-      <w:hyperlink r:id="rId62">
+      <w:hyperlink r:id="rId66">
         <w:r>
           <w:rPr>
             <w:rStyle w:val="Hyperlink"/>
@@ -4104,8 +3980,8 @@
         </w:r>
       </w:hyperlink>
     </w:p>
-    <w:bookmarkEnd w:id="63"/>
-    <w:bookmarkStart w:id="65" w:name="ref-husain2021"/>
+    <w:bookmarkEnd w:id="67"/>
+    <w:bookmarkStart w:id="69" w:name="ref-husain2021"/>
     <w:p>
       <w:pPr>
         <w:pStyle w:val="Bibliography"/>
@@ -4142,7 +4018,7 @@
       <w:r>
         <w:t xml:space="preserve"> </w:t>
       </w:r>
-      <w:hyperlink r:id="rId64">
+      <w:hyperlink r:id="rId68">
         <w:r>
           <w:rPr>
             <w:rStyle w:val="Hyperlink"/>
@@ -4151,8 +4027,8 @@
         </w:r>
       </w:hyperlink>
     </w:p>
-    <w:bookmarkEnd w:id="65"/>
-    <w:bookmarkStart w:id="67" w:name="ref-kinney2023"/>
+    <w:bookmarkEnd w:id="69"/>
+    <w:bookmarkStart w:id="71" w:name="ref-kinney2023"/>
     <w:p>
       <w:pPr>
         <w:pStyle w:val="Bibliography"/>
@@ -4198,7 +4074,7 @@
       <w:r>
         <w:t xml:space="preserve"> </w:t>
       </w:r>
-      <w:hyperlink r:id="rId66">
+      <w:hyperlink r:id="rId70">
         <w:r>
           <w:rPr>
             <w:rStyle w:val="Hyperlink"/>
@@ -4207,8 +4083,8 @@
         </w:r>
       </w:hyperlink>
     </w:p>
-    <w:bookmarkEnd w:id="67"/>
-    <w:bookmarkStart w:id="69" w:name="ref-lund2020"/>
+    <w:bookmarkEnd w:id="71"/>
+    <w:bookmarkStart w:id="73" w:name="ref-lund2020"/>
     <w:p>
       <w:pPr>
         <w:pStyle w:val="Bibliography"/>
@@ -4263,7 +4139,7 @@
       <w:r>
         <w:t xml:space="preserve"> </w:t>
       </w:r>
-      <w:hyperlink r:id="rId68">
+      <w:hyperlink r:id="rId72">
         <w:r>
           <w:rPr>
             <w:rStyle w:val="Hyperlink"/>
@@ -4272,8 +4148,8 @@
         </w:r>
       </w:hyperlink>
     </w:p>
-    <w:bookmarkEnd w:id="69"/>
-    <w:bookmarkStart w:id="71" w:name="ref-page2021prisma"/>
+    <w:bookmarkEnd w:id="73"/>
+    <w:bookmarkStart w:id="75" w:name="ref-page2021prisma"/>
     <w:p>
       <w:pPr>
         <w:pStyle w:val="Bibliography"/>
@@ -4322,7 +4198,7 @@
       <w:r>
         <w:t xml:space="preserve"> </w:t>
       </w:r>
-      <w:hyperlink r:id="rId70">
+      <w:hyperlink r:id="rId74">
         <w:r>
           <w:rPr>
             <w:rStyle w:val="Hyperlink"/>
@@ -4331,8 +4207,8 @@
         </w:r>
       </w:hyperlink>
     </w:p>
-    <w:bookmarkEnd w:id="71"/>
-    <w:bookmarkStart w:id="73" w:name="ref-rahman2008"/>
+    <w:bookmarkEnd w:id="75"/>
+    <w:bookmarkStart w:id="77" w:name="ref-rahman2008"/>
     <w:p>
       <w:pPr>
         <w:pStyle w:val="Bibliography"/>
@@ -4378,7 +4254,7 @@
       <w:r>
         <w:t xml:space="preserve"> </w:t>
       </w:r>
-      <w:hyperlink r:id="rId72">
+      <w:hyperlink r:id="rId76">
         <w:r>
           <w:rPr>
             <w:rStyle w:val="Hyperlink"/>
@@ -4387,8 +4263,8 @@
         </w:r>
       </w:hyperlink>
     </w:p>
-    <w:bookmarkEnd w:id="73"/>
-    <w:bookmarkStart w:id="75" w:name="ref-rossouw2021"/>
+    <w:bookmarkEnd w:id="77"/>
+    <w:bookmarkStart w:id="79" w:name="ref-rossouw2021"/>
     <w:p>
       <w:pPr>
         <w:pStyle w:val="Bibliography"/>
@@ -4425,7 +4301,7 @@
       <w:r>
         <w:t xml:space="preserve"> </w:t>
       </w:r>
-      <w:hyperlink r:id="rId74">
+      <w:hyperlink r:id="rId78">
         <w:r>
           <w:rPr>
             <w:rStyle w:val="Hyperlink"/>
@@ -4434,8 +4310,8 @@
         </w:r>
       </w:hyperlink>
     </w:p>
-    <w:bookmarkEnd w:id="75"/>
-    <w:bookmarkStart w:id="77" w:name="ref-rotheramborus2023"/>
+    <w:bookmarkEnd w:id="79"/>
+    <w:bookmarkStart w:id="81" w:name="ref-rotheramborus2023"/>
     <w:p>
       <w:pPr>
         <w:pStyle w:val="Bibliography"/>
@@ -4481,7 +4357,7 @@
       <w:r>
         <w:t xml:space="preserve"> </w:t>
       </w:r>
-      <w:hyperlink r:id="rId76">
+      <w:hyperlink r:id="rId80">
         <w:r>
           <w:rPr>
             <w:rStyle w:val="Hyperlink"/>
@@ -4490,8 +4366,8 @@
         </w:r>
       </w:hyperlink>
     </w:p>
-    <w:bookmarkEnd w:id="77"/>
-    <w:bookmarkStart w:id="79" w:name="ref-stein2014"/>
+    <w:bookmarkEnd w:id="81"/>
+    <w:bookmarkStart w:id="83" w:name="ref-stein2014"/>
     <w:p>
       <w:pPr>
         <w:pStyle w:val="Bibliography"/>
@@ -4528,7 +4404,7 @@
       <w:r>
         <w:t xml:space="preserve"> </w:t>
       </w:r>
-      <w:hyperlink r:id="rId78">
+      <w:hyperlink r:id="rId82">
         <w:r>
           <w:rPr>
             <w:rStyle w:val="Hyperlink"/>
@@ -4537,8 +4413,8 @@
         </w:r>
       </w:hyperlink>
     </w:p>
-    <w:bookmarkEnd w:id="79"/>
-    <w:bookmarkStart w:id="81" w:name="ref-sterne2019rob2"/>
+    <w:bookmarkEnd w:id="83"/>
+    <w:bookmarkStart w:id="85" w:name="ref-sterne2019rob2"/>
     <w:p>
       <w:pPr>
         <w:pStyle w:val="Bibliography"/>
@@ -4587,7 +4463,7 @@
       <w:r>
         <w:t xml:space="preserve"> </w:t>
       </w:r>
-      <w:hyperlink r:id="rId80">
+      <w:hyperlink r:id="rId84">
         <w:r>
           <w:rPr>
             <w:rStyle w:val="Hyperlink"/>
@@ -4596,8 +4472,8 @@
         </w:r>
       </w:hyperlink>
     </w:p>
-    <w:bookmarkEnd w:id="81"/>
-    <w:bookmarkStart w:id="83" w:name="ref-surkan2011"/>
+    <w:bookmarkEnd w:id="85"/>
+    <w:bookmarkStart w:id="87" w:name="ref-surkan2011"/>
     <w:p>
       <w:pPr>
         <w:pStyle w:val="Bibliography"/>
@@ -4634,7 +4510,7 @@
       <w:r>
         <w:t xml:space="preserve"> </w:t>
       </w:r>
-      <w:hyperlink r:id="rId82">
+      <w:hyperlink r:id="rId86">
         <w:r>
           <w:rPr>
             <w:rStyle w:val="Hyperlink"/>
@@ -4643,8 +4519,8 @@
         </w:r>
       </w:hyperlink>
     </w:p>
-    <w:bookmarkEnd w:id="83"/>
-    <w:bookmarkStart w:id="85" w:name="ref-vanzyl2026rwa"/>
+    <w:bookmarkEnd w:id="87"/>
+    <w:bookmarkStart w:id="89" w:name="ref-vanzyl2026rwa"/>
     <w:p>
       <w:pPr>
         <w:pStyle w:val="Bibliography"/>
@@ -4671,7 +4547,7 @@
       <w:r>
         <w:t xml:space="preserve"> </w:t>
       </w:r>
-      <w:hyperlink r:id="rId84">
+      <w:hyperlink r:id="rId88">
         <w:r>
           <w:rPr>
             <w:rStyle w:val="Hyperlink"/>
@@ -4680,8 +4556,8 @@
         </w:r>
       </w:hyperlink>
     </w:p>
-    <w:bookmarkEnd w:id="85"/>
-    <w:bookmarkStart w:id="87" w:name="ref-vanobberghen2020"/>
+    <w:bookmarkEnd w:id="89"/>
+    <w:bookmarkStart w:id="91" w:name="ref-vanobberghen2020"/>
     <w:p>
       <w:pPr>
         <w:pStyle w:val="Bibliography"/>
@@ -4751,7 +4627,7 @@
       <w:r>
         <w:t xml:space="preserve"> </w:t>
       </w:r>
-      <w:hyperlink r:id="rId86">
+      <w:hyperlink r:id="rId90">
         <w:r>
           <w:rPr>
             <w:rStyle w:val="Hyperlink"/>
@@ -4760,8 +4636,8 @@
         </w:r>
       </w:hyperlink>
     </w:p>
-    <w:bookmarkEnd w:id="87"/>
-    <w:bookmarkStart w:id="89" w:name="ref-wang2025"/>
+    <w:bookmarkEnd w:id="91"/>
+    <w:bookmarkStart w:id="93" w:name="ref-wang2025"/>
     <w:p>
       <w:pPr>
         <w:pStyle w:val="Bibliography"/>
@@ -4807,7 +4683,7 @@
       <w:r>
         <w:t xml:space="preserve"> </w:t>
       </w:r>
-      <w:hyperlink r:id="rId88">
+      <w:hyperlink r:id="rId92">
         <w:r>
           <w:rPr>
             <w:rStyle w:val="Hyperlink"/>
@@ -4816,8 +4692,8 @@
         </w:r>
       </w:hyperlink>
     </w:p>
-    <w:bookmarkEnd w:id="89"/>
-    <w:bookmarkStart w:id="91" w:name="ref-woody2017"/>
+    <w:bookmarkEnd w:id="93"/>
+    <w:bookmarkStart w:id="95" w:name="ref-woody2017"/>
     <w:p>
       <w:pPr>
         <w:pStyle w:val="Bibliography"/>
@@ -4854,7 +4730,7 @@
       <w:r>
         <w:t xml:space="preserve"> </w:t>
       </w:r>
-      <w:hyperlink r:id="rId90">
+      <w:hyperlink r:id="rId94">
         <w:r>
           <w:rPr>
             <w:rStyle w:val="Hyperlink"/>
@@ -4863,8 +4739,8 @@
         </w:r>
       </w:hyperlink>
     </w:p>
-    <w:bookmarkEnd w:id="91"/>
-    <w:bookmarkStart w:id="93" w:name="ref-who2008taskshifting"/>
+    <w:bookmarkEnd w:id="95"/>
+    <w:bookmarkStart w:id="97" w:name="ref-who2008taskshifting"/>
     <w:p>
       <w:pPr>
         <w:pStyle w:val="Bibliography"/>
@@ -4888,7 +4764,7 @@
       <w:r>
         <w:t xml:space="preserve"> </w:t>
       </w:r>
-      <w:hyperlink r:id="rId92">
+      <w:hyperlink r:id="rId96">
         <w:r>
           <w:rPr>
             <w:rStyle w:val="Hyperlink"/>
@@ -4897,8 +4773,8 @@
         </w:r>
       </w:hyperlink>
     </w:p>
-    <w:bookmarkEnd w:id="93"/>
-    <w:bookmarkStart w:id="95" w:name="ref-who2021atlas"/>
+    <w:bookmarkEnd w:id="97"/>
+    <w:bookmarkStart w:id="99" w:name="ref-who2021atlas"/>
     <w:p>
       <w:pPr>
         <w:pStyle w:val="Bibliography"/>
@@ -4922,7 +4798,7 @@
       <w:r>
         <w:t xml:space="preserve"> </w:t>
       </w:r>
-      <w:hyperlink r:id="rId94">
+      <w:hyperlink r:id="rId98">
         <w:r>
           <w:rPr>
             <w:rStyle w:val="Hyperlink"/>
@@ -4931,9 +4807,9 @@
         </w:r>
       </w:hyperlink>
     </w:p>
-    <w:bookmarkEnd w:id="95"/>
-    <w:bookmarkEnd w:id="96"/>
-    <w:bookmarkEnd w:id="97"/>
+    <w:bookmarkEnd w:id="99"/>
+    <w:bookmarkEnd w:id="100"/>
+    <w:bookmarkEnd w:id="101"/>
     <w:sectPr>
       <w:footnotePr>
         <w:numRestart w:val="eachSect"/>

</xml_diff>

<commit_message>
Update manuscript files to enhance clarity and formatting of PRISMA flow diagram
</commit_message>
<xml_diff>
--- a/sample_projects/chw-maternal-mental-health/manuscript.docx
+++ b/sample_projects/chw-maternal-mental-health/manuscript.docx
@@ -681,7 +681,7 @@
                   <w:r>
                     <w:drawing>
                       <wp:inline>
-                        <wp:extent cx="5334000" cy="10549114"/>
+                        <wp:extent cx="4572000" cy="7333487"/>
                         <wp:effectExtent b="0" l="0" r="0" t="0"/>
                         <wp:docPr descr="" title="" id="33" name="Picture"/>
                         <a:graphic>
@@ -702,7 +702,7 @@
                               <pic:spPr bwMode="auto">
                                 <a:xfrm>
                                   <a:off x="0" y="0"/>
-                                  <a:ext cx="5334000" cy="10549114"/>
+                                  <a:ext cx="4572000" cy="7333487"/>
                                 </a:xfrm>
                                 <a:prstGeom prst="rect">
                                   <a:avLst/>

</xml_diff>